<commit_message>
change: Adding erd diagram for week 5
</commit_message>
<xml_diff>
--- a/Meeting Reports/Meeting report- Week 5.docx
+++ b/Meeting Reports/Meeting report- Week 5.docx
@@ -1100,487 +1100,513 @@
           <w:sz w:val="22"/>
           <w:lang w:val="en-DE"/>
         </w:rPr>
-        <w:t xml:space="preserve"> application.</w:t>
-      </w:r>
-      <w:r>
-        <w:rPr>
-          <w:rFonts w:ascii="Arial" w:hAnsi="Arial"/>
-          <w:sz w:val="22"/>
-          <w:lang w:val="en-DE"/>
-        </w:rPr>
-        <w:t>We will also create state diagram for each user role and the ERD for the whole system</w:t>
-      </w:r>
-    </w:p>
-    <w:p>
-      <w:pPr>
-        <w:rPr>
-          <w:rFonts w:ascii="Arial" w:hAnsi="Arial"/>
-          <w:b/>
-          <w:sz w:val="22"/>
-          <w:u w:val="single"/>
-        </w:rPr>
-      </w:pPr>
-    </w:p>
-    <w:p>
-      <w:pPr>
-        <w:rPr>
-          <w:rFonts w:ascii="Arial" w:hAnsi="Arial"/>
-          <w:b/>
-          <w:sz w:val="22"/>
-          <w:u w:val="single"/>
-        </w:rPr>
-      </w:pPr>
-    </w:p>
-    <w:p>
-      <w:pPr>
-        <w:rPr>
-          <w:rFonts w:ascii="Arial" w:hAnsi="Arial"/>
-          <w:b/>
-          <w:sz w:val="22"/>
-          <w:u w:val="single"/>
-        </w:rPr>
-      </w:pPr>
-    </w:p>
-    <w:p>
-      <w:pPr>
-        <w:rPr>
-          <w:rFonts w:ascii="Arial" w:hAnsi="Arial"/>
-          <w:b/>
-          <w:sz w:val="22"/>
-          <w:u w:val="single"/>
-        </w:rPr>
-      </w:pPr>
-    </w:p>
-    <w:p>
-      <w:pPr>
-        <w:rPr>
-          <w:rFonts w:ascii="Arial" w:hAnsi="Arial"/>
-          <w:b/>
-          <w:sz w:val="22"/>
-          <w:u w:val="single"/>
-        </w:rPr>
-      </w:pPr>
-    </w:p>
-    <w:p>
-      <w:pPr>
-        <w:rPr>
-          <w:rFonts w:ascii="Arial" w:hAnsi="Arial"/>
-          <w:b/>
-          <w:sz w:val="22"/>
-          <w:u w:val="single"/>
-        </w:rPr>
-      </w:pPr>
-    </w:p>
-    <w:p>
-      <w:pPr>
-        <w:rPr>
-          <w:rFonts w:ascii="Arial" w:hAnsi="Arial"/>
-          <w:b/>
-          <w:sz w:val="22"/>
-          <w:u w:val="single"/>
-        </w:rPr>
-      </w:pPr>
-    </w:p>
-    <w:p>
-      <w:pPr>
-        <w:rPr>
-          <w:rFonts w:ascii="Arial" w:hAnsi="Arial"/>
-          <w:b/>
-          <w:sz w:val="22"/>
-          <w:u w:val="single"/>
-        </w:rPr>
-      </w:pPr>
-    </w:p>
-    <w:p>
-      <w:pPr>
-        <w:rPr>
-          <w:rFonts w:ascii="Arial" w:hAnsi="Arial"/>
-          <w:b/>
-          <w:sz w:val="22"/>
-          <w:u w:val="single"/>
-        </w:rPr>
-      </w:pPr>
+        <w:t xml:space="preserve"> </w:t>
+      </w:r>
+      <w:proofErr w:type="spellStart"/>
+      <w:r>
+        <w:rPr>
+          <w:rFonts w:ascii="Arial" w:hAnsi="Arial"/>
+          <w:sz w:val="22"/>
+          <w:lang w:val="en-DE"/>
+        </w:rPr>
+        <w:t>application.</w:t>
+      </w:r>
+      <w:r>
+        <w:rPr>
+          <w:rFonts w:ascii="Arial" w:hAnsi="Arial"/>
+          <w:sz w:val="22"/>
+          <w:lang w:val="en-DE"/>
+        </w:rPr>
+        <w:t>We</w:t>
+      </w:r>
+      <w:proofErr w:type="spellEnd"/>
+      <w:r>
+        <w:rPr>
+          <w:rFonts w:ascii="Arial" w:hAnsi="Arial"/>
+          <w:sz w:val="22"/>
+          <w:lang w:val="en-DE"/>
+        </w:rPr>
+        <w:t xml:space="preserve"> will also create state diagram for each user role and the ERD for the whole system</w:t>
+      </w:r>
+    </w:p>
+    <w:p>
+      <w:pPr>
+        <w:rPr>
+          <w:rFonts w:ascii="Arial" w:hAnsi="Arial"/>
+          <w:b/>
+          <w:sz w:val="22"/>
+          <w:u w:val="single"/>
+        </w:rPr>
+      </w:pPr>
+    </w:p>
+    <w:p>
+      <w:pPr>
+        <w:rPr>
+          <w:rFonts w:ascii="Arial" w:hAnsi="Arial"/>
+          <w:b/>
+          <w:sz w:val="22"/>
+          <w:u w:val="single"/>
+        </w:rPr>
+      </w:pPr>
+    </w:p>
+    <w:p>
+      <w:pPr>
+        <w:rPr>
+          <w:rFonts w:ascii="Arial" w:hAnsi="Arial"/>
+          <w:b/>
+          <w:sz w:val="22"/>
+          <w:u w:val="single"/>
+        </w:rPr>
+      </w:pPr>
+    </w:p>
+    <w:p>
+      <w:pPr>
+        <w:rPr>
+          <w:rFonts w:ascii="Arial" w:hAnsi="Arial"/>
+          <w:b/>
+          <w:sz w:val="22"/>
+          <w:u w:val="single"/>
+        </w:rPr>
+      </w:pPr>
+    </w:p>
+    <w:p>
+      <w:pPr>
+        <w:rPr>
+          <w:rFonts w:ascii="Arial" w:hAnsi="Arial"/>
+          <w:b/>
+          <w:sz w:val="22"/>
+          <w:u w:val="single"/>
+        </w:rPr>
+      </w:pPr>
+    </w:p>
+    <w:p>
+      <w:pPr>
+        <w:rPr>
+          <w:rFonts w:ascii="Arial" w:hAnsi="Arial"/>
+          <w:b/>
+          <w:sz w:val="22"/>
+          <w:u w:val="single"/>
+        </w:rPr>
+      </w:pPr>
+    </w:p>
+    <w:p>
+      <w:pPr>
+        <w:rPr>
+          <w:rFonts w:ascii="Arial" w:hAnsi="Arial"/>
+          <w:b/>
+          <w:sz w:val="22"/>
+          <w:u w:val="single"/>
+        </w:rPr>
+      </w:pPr>
+    </w:p>
+    <w:p>
+      <w:pPr>
+        <w:rPr>
+          <w:rFonts w:ascii="Arial" w:hAnsi="Arial"/>
+          <w:b/>
+          <w:sz w:val="22"/>
+          <w:u w:val="single"/>
+        </w:rPr>
+      </w:pPr>
+    </w:p>
+    <w:p>
+      <w:pPr>
+        <w:rPr>
+          <w:rFonts w:ascii="Arial" w:hAnsi="Arial"/>
+          <w:b/>
+          <w:sz w:val="22"/>
+          <w:u w:val="single"/>
+        </w:rPr>
+      </w:pPr>
+    </w:p>
+    <w:p>
+      <w:pPr>
+        <w:rPr>
+          <w:rFonts w:ascii="Arial" w:hAnsi="Arial"/>
+          <w:b/>
+          <w:sz w:val="22"/>
+          <w:u w:val="single"/>
+        </w:rPr>
+      </w:pPr>
+      <w:r>
+        <w:rPr>
+          <w:rFonts w:ascii="Arial" w:hAnsi="Arial"/>
+          <w:b/>
+          <w:sz w:val="22"/>
+          <w:u w:val="single"/>
+        </w:rPr>
+        <w:lastRenderedPageBreak/>
+        <w:t>Tasks Assigned:</w:t>
+      </w:r>
+    </w:p>
+    <w:p>
+      <w:pPr>
+        <w:rPr>
+          <w:rFonts w:ascii="Arial" w:hAnsi="Arial"/>
+          <w:b/>
+          <w:sz w:val="22"/>
+          <w:u w:val="single"/>
+        </w:rPr>
+      </w:pPr>
+    </w:p>
+    <w:p>
+      <w:pPr>
+        <w:rPr>
+          <w:rFonts w:ascii="Arial" w:hAnsi="Arial"/>
+          <w:sz w:val="22"/>
+          <w:lang w:val="en-DE"/>
+        </w:rPr>
+      </w:pPr>
+      <w:r>
+        <w:rPr>
+          <w:rFonts w:ascii="Arial" w:hAnsi="Arial"/>
+          <w:b/>
+          <w:sz w:val="22"/>
+          <w:lang w:val="en-DE"/>
+        </w:rPr>
+        <w:t xml:space="preserve">Kevin </w:t>
+      </w:r>
+      <w:proofErr w:type="spellStart"/>
+      <w:r>
+        <w:rPr>
+          <w:rFonts w:ascii="Arial" w:hAnsi="Arial"/>
+          <w:b/>
+          <w:sz w:val="22"/>
+          <w:lang w:val="en-DE"/>
+        </w:rPr>
+        <w:t>Muho</w:t>
+      </w:r>
+      <w:proofErr w:type="spellEnd"/>
+      <w:r>
+        <w:rPr>
+          <w:rFonts w:ascii="Arial" w:hAnsi="Arial"/>
+          <w:b/>
+          <w:sz w:val="22"/>
+          <w:lang w:val="en-DE"/>
+        </w:rPr>
+        <w:t xml:space="preserve">, Anisa </w:t>
+      </w:r>
+      <w:proofErr w:type="spellStart"/>
+      <w:r>
+        <w:rPr>
+          <w:rFonts w:ascii="Arial" w:hAnsi="Arial"/>
+          <w:b/>
+          <w:sz w:val="22"/>
+          <w:lang w:val="en-DE"/>
+        </w:rPr>
+        <w:t>Domi</w:t>
+      </w:r>
+      <w:proofErr w:type="spellEnd"/>
+      <w:r>
+        <w:rPr>
+          <w:rFonts w:ascii="Arial" w:hAnsi="Arial"/>
+          <w:b/>
+          <w:sz w:val="22"/>
+          <w:lang w:val="en-DE"/>
+        </w:rPr>
+        <w:t xml:space="preserve">, </w:t>
+      </w:r>
+      <w:proofErr w:type="spellStart"/>
+      <w:r>
+        <w:rPr>
+          <w:rFonts w:ascii="Arial" w:hAnsi="Arial"/>
+          <w:b/>
+          <w:sz w:val="22"/>
+          <w:lang w:val="en-DE"/>
+        </w:rPr>
+        <w:t>Desard</w:t>
+      </w:r>
+      <w:proofErr w:type="spellEnd"/>
+      <w:r>
+        <w:rPr>
+          <w:rFonts w:ascii="Arial" w:hAnsi="Arial"/>
+          <w:b/>
+          <w:sz w:val="22"/>
+          <w:lang w:val="en-DE"/>
+        </w:rPr>
+        <w:t xml:space="preserve"> </w:t>
+      </w:r>
+      <w:proofErr w:type="spellStart"/>
+      <w:proofErr w:type="gramStart"/>
+      <w:r>
+        <w:rPr>
+          <w:rFonts w:ascii="Arial" w:hAnsi="Arial"/>
+          <w:b/>
+          <w:sz w:val="22"/>
+          <w:lang w:val="en-DE"/>
+        </w:rPr>
+        <w:t>Lybeshari,Ledio</w:t>
+      </w:r>
+      <w:proofErr w:type="spellEnd"/>
+      <w:proofErr w:type="gramEnd"/>
+      <w:r>
+        <w:rPr>
+          <w:rFonts w:ascii="Arial" w:hAnsi="Arial"/>
+          <w:b/>
+          <w:sz w:val="22"/>
+          <w:lang w:val="en-DE"/>
+        </w:rPr>
+        <w:t xml:space="preserve"> </w:t>
+      </w:r>
+      <w:proofErr w:type="spellStart"/>
+      <w:r>
+        <w:rPr>
+          <w:rFonts w:ascii="Arial" w:hAnsi="Arial"/>
+          <w:b/>
+          <w:sz w:val="22"/>
+          <w:lang w:val="en-DE"/>
+        </w:rPr>
+        <w:t>Tafciu</w:t>
+      </w:r>
+      <w:proofErr w:type="spellEnd"/>
+      <w:r>
+        <w:rPr>
+          <w:rFonts w:ascii="Arial" w:hAnsi="Arial"/>
+          <w:b/>
+          <w:sz w:val="22"/>
+          <w:lang w:val="en-DE"/>
+        </w:rPr>
+        <w:t xml:space="preserve">, </w:t>
+      </w:r>
+      <w:proofErr w:type="spellStart"/>
+      <w:r>
+        <w:rPr>
+          <w:rFonts w:ascii="Arial" w:hAnsi="Arial"/>
+          <w:b/>
+          <w:sz w:val="22"/>
+          <w:lang w:val="en-DE"/>
+        </w:rPr>
+        <w:t>Ornelt</w:t>
+      </w:r>
+      <w:proofErr w:type="spellEnd"/>
+      <w:r>
+        <w:rPr>
+          <w:rFonts w:ascii="Arial" w:hAnsi="Arial"/>
+          <w:b/>
+          <w:sz w:val="22"/>
+          <w:lang w:val="en-DE"/>
+        </w:rPr>
+        <w:t xml:space="preserve"> </w:t>
+      </w:r>
+      <w:proofErr w:type="spellStart"/>
+      <w:r>
+        <w:rPr>
+          <w:rFonts w:ascii="Arial" w:hAnsi="Arial"/>
+          <w:b/>
+          <w:sz w:val="22"/>
+          <w:lang w:val="en-DE"/>
+        </w:rPr>
+        <w:t>Lemellari</w:t>
+      </w:r>
+      <w:proofErr w:type="spellEnd"/>
+      <w:r>
+        <w:rPr>
+          <w:rFonts w:ascii="Arial" w:hAnsi="Arial"/>
+          <w:b/>
+          <w:sz w:val="22"/>
+          <w:lang w:val="en-DE"/>
+        </w:rPr>
+        <w:t xml:space="preserve">, Matias Bali, </w:t>
+      </w:r>
+      <w:proofErr w:type="spellStart"/>
+      <w:r>
+        <w:rPr>
+          <w:rFonts w:ascii="Arial" w:hAnsi="Arial"/>
+          <w:b/>
+          <w:sz w:val="22"/>
+          <w:lang w:val="en-DE"/>
+        </w:rPr>
+        <w:t>Haidi</w:t>
+      </w:r>
+      <w:proofErr w:type="spellEnd"/>
+      <w:r>
+        <w:rPr>
+          <w:rFonts w:ascii="Arial" w:hAnsi="Arial"/>
+          <w:b/>
+          <w:sz w:val="22"/>
+          <w:lang w:val="en-DE"/>
+        </w:rPr>
+        <w:t xml:space="preserve"> Toto- </w:t>
+      </w:r>
+      <w:r>
+        <w:rPr>
+          <w:rFonts w:ascii="Arial" w:hAnsi="Arial"/>
+          <w:sz w:val="22"/>
+          <w:lang w:val="en-DE"/>
+        </w:rPr>
+        <w:t xml:space="preserve">Improving the use case tables and </w:t>
+      </w:r>
+      <w:proofErr w:type="spellStart"/>
+      <w:r>
+        <w:rPr>
+          <w:rFonts w:ascii="Arial" w:hAnsi="Arial"/>
+          <w:sz w:val="22"/>
+          <w:lang w:val="en-DE"/>
+        </w:rPr>
+        <w:t>acitivity</w:t>
+      </w:r>
+      <w:proofErr w:type="spellEnd"/>
+      <w:r>
+        <w:rPr>
+          <w:rFonts w:ascii="Arial" w:hAnsi="Arial"/>
+          <w:sz w:val="22"/>
+          <w:lang w:val="en-DE"/>
+        </w:rPr>
+        <w:t>/</w:t>
+      </w:r>
+      <w:proofErr w:type="spellStart"/>
+      <w:r>
+        <w:rPr>
+          <w:rFonts w:ascii="Arial" w:hAnsi="Arial"/>
+          <w:sz w:val="22"/>
+          <w:lang w:val="en-DE"/>
+        </w:rPr>
+        <w:t>swimlane</w:t>
+      </w:r>
+      <w:proofErr w:type="spellEnd"/>
+      <w:r>
+        <w:rPr>
+          <w:rFonts w:ascii="Arial" w:hAnsi="Arial"/>
+          <w:sz w:val="22"/>
+          <w:lang w:val="en-DE"/>
+        </w:rPr>
+        <w:t xml:space="preserve"> diagrams for the requirements that were assigned to them in the previous weeks.</w:t>
+      </w:r>
+    </w:p>
+    <w:p>
+      <w:pPr>
+        <w:rPr>
+          <w:rFonts w:ascii="Arial" w:hAnsi="Arial"/>
+          <w:sz w:val="22"/>
+          <w:lang w:val="en-DE"/>
+        </w:rPr>
+      </w:pPr>
+    </w:p>
+    <w:p>
+      <w:pPr>
+        <w:rPr>
+          <w:rFonts w:ascii="Arial" w:hAnsi="Arial"/>
+          <w:sz w:val="22"/>
+          <w:lang w:val="en-DE"/>
+        </w:rPr>
+      </w:pPr>
+      <w:r>
+        <w:rPr>
+          <w:rFonts w:ascii="Arial" w:hAnsi="Arial"/>
+          <w:b/>
+          <w:sz w:val="22"/>
+          <w:lang w:val="en-DE"/>
+        </w:rPr>
+        <w:t xml:space="preserve">Kevin </w:t>
+      </w:r>
+      <w:proofErr w:type="spellStart"/>
+      <w:r>
+        <w:rPr>
+          <w:rFonts w:ascii="Arial" w:hAnsi="Arial"/>
+          <w:b/>
+          <w:sz w:val="22"/>
+          <w:lang w:val="en-DE"/>
+        </w:rPr>
+        <w:t>Muho</w:t>
+      </w:r>
+      <w:proofErr w:type="spellEnd"/>
+      <w:r>
+        <w:rPr>
+          <w:rFonts w:ascii="Arial" w:hAnsi="Arial"/>
+          <w:b/>
+          <w:sz w:val="22"/>
+          <w:lang w:val="en-DE"/>
+        </w:rPr>
+        <w:t xml:space="preserve">- </w:t>
+      </w:r>
+      <w:r>
+        <w:rPr>
+          <w:rFonts w:ascii="Arial" w:hAnsi="Arial"/>
+          <w:sz w:val="22"/>
+          <w:lang w:val="en-DE"/>
+        </w:rPr>
+        <w:t>Improving the use case diagram</w:t>
+      </w:r>
+      <w:r>
+        <w:rPr>
+          <w:rFonts w:ascii="Arial" w:hAnsi="Arial"/>
+          <w:sz w:val="22"/>
+          <w:lang w:val="en-DE"/>
+        </w:rPr>
+        <w:t>, designing the ERD</w:t>
+      </w:r>
+      <w:r>
+        <w:rPr>
+          <w:rFonts w:ascii="Arial" w:hAnsi="Arial"/>
+          <w:sz w:val="22"/>
+          <w:lang w:val="en-DE"/>
+        </w:rPr>
+        <w:t>.</w:t>
+      </w:r>
+    </w:p>
+    <w:p>
+      <w:pPr>
+        <w:rPr>
+          <w:rFonts w:ascii="Arial" w:hAnsi="Arial"/>
+          <w:sz w:val="22"/>
+          <w:lang w:val="en-DE"/>
+        </w:rPr>
+      </w:pPr>
+    </w:p>
+    <w:p>
+      <w:pPr>
+        <w:rPr>
+          <w:rFonts w:ascii="Arial" w:hAnsi="Arial"/>
+          <w:sz w:val="22"/>
+          <w:lang w:val="en-DE"/>
+        </w:rPr>
+      </w:pPr>
+      <w:r>
+        <w:rPr>
+          <w:rFonts w:ascii="Arial" w:hAnsi="Arial"/>
+          <w:b/>
+          <w:sz w:val="22"/>
+          <w:lang w:val="en-DE"/>
+        </w:rPr>
+        <w:t xml:space="preserve">Anisa </w:t>
+      </w:r>
+      <w:proofErr w:type="spellStart"/>
+      <w:r>
+        <w:rPr>
+          <w:rFonts w:ascii="Arial" w:hAnsi="Arial"/>
+          <w:b/>
+          <w:sz w:val="22"/>
+          <w:lang w:val="en-DE"/>
+        </w:rPr>
+        <w:t>Domi</w:t>
+      </w:r>
+      <w:proofErr w:type="spellEnd"/>
+      <w:r>
+        <w:rPr>
+          <w:rFonts w:ascii="Arial" w:hAnsi="Arial"/>
+          <w:b/>
+          <w:sz w:val="22"/>
+          <w:lang w:val="en-DE"/>
+        </w:rPr>
+        <w:t xml:space="preserve">- </w:t>
+      </w:r>
+      <w:r>
+        <w:rPr>
+          <w:rFonts w:ascii="Arial" w:hAnsi="Arial"/>
+          <w:sz w:val="22"/>
+          <w:lang w:val="en-DE"/>
+        </w:rPr>
+        <w:t>Creating</w:t>
+      </w:r>
       <w:bookmarkStart w:id="0" w:name="_GoBack"/>
       <w:bookmarkEnd w:id="0"/>
-    </w:p>
-    <w:p>
-      <w:pPr>
-        <w:rPr>
-          <w:rFonts w:ascii="Arial" w:hAnsi="Arial"/>
-          <w:b/>
-          <w:sz w:val="22"/>
-          <w:u w:val="single"/>
-        </w:rPr>
-      </w:pPr>
-      <w:r>
-        <w:rPr>
-          <w:rFonts w:ascii="Arial" w:hAnsi="Arial"/>
-          <w:b/>
-          <w:sz w:val="22"/>
-          <w:u w:val="single"/>
-        </w:rPr>
-        <w:lastRenderedPageBreak/>
-        <w:t>Tasks Assigned:</w:t>
-      </w:r>
-    </w:p>
-    <w:p>
-      <w:pPr>
-        <w:rPr>
-          <w:rFonts w:ascii="Arial" w:hAnsi="Arial"/>
-          <w:b/>
-          <w:sz w:val="22"/>
-          <w:u w:val="single"/>
-        </w:rPr>
-      </w:pPr>
-    </w:p>
-    <w:p>
-      <w:pPr>
-        <w:rPr>
-          <w:rFonts w:ascii="Arial" w:hAnsi="Arial"/>
-          <w:sz w:val="22"/>
-          <w:lang w:val="en-DE"/>
-        </w:rPr>
-      </w:pPr>
-      <w:r>
-        <w:rPr>
-          <w:rFonts w:ascii="Arial" w:hAnsi="Arial"/>
-          <w:b/>
-          <w:sz w:val="22"/>
-          <w:lang w:val="en-DE"/>
-        </w:rPr>
-        <w:t xml:space="preserve">Kevin </w:t>
-      </w:r>
-      <w:proofErr w:type="spellStart"/>
-      <w:r>
-        <w:rPr>
-          <w:rFonts w:ascii="Arial" w:hAnsi="Arial"/>
-          <w:b/>
-          <w:sz w:val="22"/>
-          <w:lang w:val="en-DE"/>
-        </w:rPr>
-        <w:t>Muho</w:t>
-      </w:r>
-      <w:proofErr w:type="spellEnd"/>
-      <w:r>
-        <w:rPr>
-          <w:rFonts w:ascii="Arial" w:hAnsi="Arial"/>
-          <w:b/>
-          <w:sz w:val="22"/>
-          <w:lang w:val="en-DE"/>
-        </w:rPr>
-        <w:t xml:space="preserve">, Anisa </w:t>
-      </w:r>
-      <w:proofErr w:type="spellStart"/>
-      <w:r>
-        <w:rPr>
-          <w:rFonts w:ascii="Arial" w:hAnsi="Arial"/>
-          <w:b/>
-          <w:sz w:val="22"/>
-          <w:lang w:val="en-DE"/>
-        </w:rPr>
-        <w:t>Domi</w:t>
-      </w:r>
-      <w:proofErr w:type="spellEnd"/>
-      <w:r>
-        <w:rPr>
-          <w:rFonts w:ascii="Arial" w:hAnsi="Arial"/>
-          <w:b/>
-          <w:sz w:val="22"/>
-          <w:lang w:val="en-DE"/>
-        </w:rPr>
-        <w:t xml:space="preserve">, </w:t>
-      </w:r>
-      <w:proofErr w:type="spellStart"/>
-      <w:r>
-        <w:rPr>
-          <w:rFonts w:ascii="Arial" w:hAnsi="Arial"/>
-          <w:b/>
-          <w:sz w:val="22"/>
-          <w:lang w:val="en-DE"/>
-        </w:rPr>
-        <w:t>Desard</w:t>
-      </w:r>
-      <w:proofErr w:type="spellEnd"/>
-      <w:r>
-        <w:rPr>
-          <w:rFonts w:ascii="Arial" w:hAnsi="Arial"/>
-          <w:b/>
-          <w:sz w:val="22"/>
-          <w:lang w:val="en-DE"/>
-        </w:rPr>
-        <w:t xml:space="preserve"> </w:t>
-      </w:r>
-      <w:proofErr w:type="spellStart"/>
-      <w:proofErr w:type="gramStart"/>
-      <w:r>
-        <w:rPr>
-          <w:rFonts w:ascii="Arial" w:hAnsi="Arial"/>
-          <w:b/>
-          <w:sz w:val="22"/>
-          <w:lang w:val="en-DE"/>
-        </w:rPr>
-        <w:t>Lybeshari,Ledio</w:t>
-      </w:r>
-      <w:proofErr w:type="spellEnd"/>
-      <w:proofErr w:type="gramEnd"/>
-      <w:r>
-        <w:rPr>
-          <w:rFonts w:ascii="Arial" w:hAnsi="Arial"/>
-          <w:b/>
-          <w:sz w:val="22"/>
-          <w:lang w:val="en-DE"/>
-        </w:rPr>
-        <w:t xml:space="preserve"> </w:t>
-      </w:r>
-      <w:proofErr w:type="spellStart"/>
-      <w:r>
-        <w:rPr>
-          <w:rFonts w:ascii="Arial" w:hAnsi="Arial"/>
-          <w:b/>
-          <w:sz w:val="22"/>
-          <w:lang w:val="en-DE"/>
-        </w:rPr>
-        <w:t>Tafciu</w:t>
-      </w:r>
-      <w:proofErr w:type="spellEnd"/>
-      <w:r>
-        <w:rPr>
-          <w:rFonts w:ascii="Arial" w:hAnsi="Arial"/>
-          <w:b/>
-          <w:sz w:val="22"/>
-          <w:lang w:val="en-DE"/>
-        </w:rPr>
-        <w:t xml:space="preserve">, </w:t>
-      </w:r>
-      <w:proofErr w:type="spellStart"/>
-      <w:r>
-        <w:rPr>
-          <w:rFonts w:ascii="Arial" w:hAnsi="Arial"/>
-          <w:b/>
-          <w:sz w:val="22"/>
-          <w:lang w:val="en-DE"/>
-        </w:rPr>
-        <w:t>Ornelt</w:t>
-      </w:r>
-      <w:proofErr w:type="spellEnd"/>
-      <w:r>
-        <w:rPr>
-          <w:rFonts w:ascii="Arial" w:hAnsi="Arial"/>
-          <w:b/>
-          <w:sz w:val="22"/>
-          <w:lang w:val="en-DE"/>
-        </w:rPr>
-        <w:t xml:space="preserve"> </w:t>
-      </w:r>
-      <w:proofErr w:type="spellStart"/>
-      <w:r>
-        <w:rPr>
-          <w:rFonts w:ascii="Arial" w:hAnsi="Arial"/>
-          <w:b/>
-          <w:sz w:val="22"/>
-          <w:lang w:val="en-DE"/>
-        </w:rPr>
-        <w:t>Lemellari</w:t>
-      </w:r>
-      <w:proofErr w:type="spellEnd"/>
-      <w:r>
-        <w:rPr>
-          <w:rFonts w:ascii="Arial" w:hAnsi="Arial"/>
-          <w:b/>
-          <w:sz w:val="22"/>
-          <w:lang w:val="en-DE"/>
-        </w:rPr>
-        <w:t xml:space="preserve">, Matias Bali, </w:t>
-      </w:r>
-      <w:proofErr w:type="spellStart"/>
-      <w:r>
-        <w:rPr>
-          <w:rFonts w:ascii="Arial" w:hAnsi="Arial"/>
-          <w:b/>
-          <w:sz w:val="22"/>
-          <w:lang w:val="en-DE"/>
-        </w:rPr>
-        <w:t>Haidi</w:t>
-      </w:r>
-      <w:proofErr w:type="spellEnd"/>
-      <w:r>
-        <w:rPr>
-          <w:rFonts w:ascii="Arial" w:hAnsi="Arial"/>
-          <w:b/>
-          <w:sz w:val="22"/>
-          <w:lang w:val="en-DE"/>
-        </w:rPr>
-        <w:t xml:space="preserve"> Toto- </w:t>
-      </w:r>
-      <w:r>
-        <w:rPr>
-          <w:rFonts w:ascii="Arial" w:hAnsi="Arial"/>
-          <w:sz w:val="22"/>
-          <w:lang w:val="en-DE"/>
-        </w:rPr>
-        <w:t xml:space="preserve">Improving the use case tables and </w:t>
-      </w:r>
-      <w:proofErr w:type="spellStart"/>
-      <w:r>
-        <w:rPr>
-          <w:rFonts w:ascii="Arial" w:hAnsi="Arial"/>
-          <w:sz w:val="22"/>
-          <w:lang w:val="en-DE"/>
-        </w:rPr>
-        <w:t>acitivity</w:t>
-      </w:r>
-      <w:proofErr w:type="spellEnd"/>
-      <w:r>
-        <w:rPr>
-          <w:rFonts w:ascii="Arial" w:hAnsi="Arial"/>
-          <w:sz w:val="22"/>
-          <w:lang w:val="en-DE"/>
-        </w:rPr>
-        <w:t>/</w:t>
-      </w:r>
-      <w:proofErr w:type="spellStart"/>
-      <w:r>
-        <w:rPr>
-          <w:rFonts w:ascii="Arial" w:hAnsi="Arial"/>
-          <w:sz w:val="22"/>
-          <w:lang w:val="en-DE"/>
-        </w:rPr>
-        <w:t>swimlane</w:t>
-      </w:r>
-      <w:proofErr w:type="spellEnd"/>
-      <w:r>
-        <w:rPr>
-          <w:rFonts w:ascii="Arial" w:hAnsi="Arial"/>
-          <w:sz w:val="22"/>
-          <w:lang w:val="en-DE"/>
-        </w:rPr>
-        <w:t xml:space="preserve"> diagrams for the requirements that were assigned to them in the previous weeks.</w:t>
-      </w:r>
-    </w:p>
-    <w:p>
-      <w:pPr>
-        <w:rPr>
-          <w:rFonts w:ascii="Arial" w:hAnsi="Arial"/>
-          <w:sz w:val="22"/>
-          <w:lang w:val="en-DE"/>
-        </w:rPr>
-      </w:pPr>
-    </w:p>
-    <w:p>
-      <w:pPr>
-        <w:rPr>
-          <w:rFonts w:ascii="Arial" w:hAnsi="Arial"/>
-          <w:sz w:val="22"/>
-          <w:lang w:val="en-DE"/>
-        </w:rPr>
-      </w:pPr>
-      <w:r>
-        <w:rPr>
-          <w:rFonts w:ascii="Arial" w:hAnsi="Arial"/>
-          <w:b/>
-          <w:sz w:val="22"/>
-          <w:lang w:val="en-DE"/>
-        </w:rPr>
-        <w:t xml:space="preserve">Kevin </w:t>
-      </w:r>
-      <w:proofErr w:type="spellStart"/>
-      <w:r>
-        <w:rPr>
-          <w:rFonts w:ascii="Arial" w:hAnsi="Arial"/>
-          <w:b/>
-          <w:sz w:val="22"/>
-          <w:lang w:val="en-DE"/>
-        </w:rPr>
-        <w:t>Muho</w:t>
-      </w:r>
-      <w:proofErr w:type="spellEnd"/>
-      <w:r>
-        <w:rPr>
-          <w:rFonts w:ascii="Arial" w:hAnsi="Arial"/>
-          <w:b/>
-          <w:sz w:val="22"/>
-          <w:lang w:val="en-DE"/>
-        </w:rPr>
-        <w:t xml:space="preserve">- </w:t>
-      </w:r>
-      <w:r>
-        <w:rPr>
-          <w:rFonts w:ascii="Arial" w:hAnsi="Arial"/>
-          <w:sz w:val="22"/>
-          <w:lang w:val="en-DE"/>
-        </w:rPr>
-        <w:t>Improving the use case diagram</w:t>
-      </w:r>
-      <w:r>
-        <w:rPr>
-          <w:rFonts w:ascii="Arial" w:hAnsi="Arial"/>
-          <w:sz w:val="22"/>
-          <w:lang w:val="en-DE"/>
-        </w:rPr>
-        <w:t>, designing the ERD</w:t>
-      </w:r>
-      <w:r>
-        <w:rPr>
-          <w:rFonts w:ascii="Arial" w:hAnsi="Arial"/>
-          <w:sz w:val="22"/>
-          <w:lang w:val="en-DE"/>
-        </w:rPr>
-        <w:t>.</w:t>
-      </w:r>
-    </w:p>
-    <w:p>
-      <w:pPr>
-        <w:rPr>
-          <w:rFonts w:ascii="Arial" w:hAnsi="Arial"/>
-          <w:sz w:val="22"/>
-          <w:lang w:val="en-DE"/>
-        </w:rPr>
-      </w:pPr>
-    </w:p>
-    <w:p>
-      <w:pPr>
-        <w:rPr>
-          <w:rFonts w:ascii="Arial" w:hAnsi="Arial"/>
-          <w:sz w:val="22"/>
-          <w:lang w:val="en-DE"/>
-        </w:rPr>
-      </w:pPr>
-      <w:r>
-        <w:rPr>
-          <w:rFonts w:ascii="Arial" w:hAnsi="Arial"/>
-          <w:b/>
-          <w:sz w:val="22"/>
-          <w:lang w:val="en-DE"/>
-        </w:rPr>
-        <w:t xml:space="preserve">Anisa </w:t>
-      </w:r>
-      <w:proofErr w:type="spellStart"/>
-      <w:r>
-        <w:rPr>
-          <w:rFonts w:ascii="Arial" w:hAnsi="Arial"/>
-          <w:b/>
-          <w:sz w:val="22"/>
-          <w:lang w:val="en-DE"/>
-        </w:rPr>
-        <w:t>Domi</w:t>
-      </w:r>
-      <w:proofErr w:type="spellEnd"/>
-      <w:r>
-        <w:rPr>
-          <w:rFonts w:ascii="Arial" w:hAnsi="Arial"/>
-          <w:b/>
-          <w:sz w:val="22"/>
-          <w:lang w:val="en-DE"/>
-        </w:rPr>
-        <w:t xml:space="preserve">- </w:t>
-      </w:r>
-      <w:r>
-        <w:rPr>
-          <w:rFonts w:ascii="Arial" w:hAnsi="Arial"/>
-          <w:sz w:val="22"/>
-          <w:lang w:val="en-DE"/>
-        </w:rPr>
-        <w:t>Creating the 1 state diagram for each actor</w:t>
+      <w:r>
+        <w:rPr>
+          <w:rFonts w:ascii="Arial" w:hAnsi="Arial"/>
+          <w:sz w:val="22"/>
+          <w:lang w:val="en-DE"/>
+        </w:rPr>
+        <w:t xml:space="preserve"> 1 state diagram for each actor</w:t>
       </w:r>
       <w:r>
         <w:rPr>

</xml_diff>